<commit_message>
Redige a Declaração de Fé (Anexo I) do Estatuto
Co-Authored-By: Claude Opus 5.5 <noreply@anthropic.com>
Claude-Session: https://claude.ai/code/session_01BEp8NqqHQWjkMmYzbfUpgC
</commit_message>
<xml_diff>
--- a/estatuto-igreja/Estatuto_Social_Igreja_ISAC_v2.docx
+++ b/estatuto-igreja/Estatuto_Social_Igreja_ISAC_v2.docx
@@ -4521,6 +4521,11 @@
       </w:r>
     </w:p>
     <w:p>
+      <w:r>
+        <w:br w:type="page"/>
+      </w:r>
+    </w:p>
+    <w:p>
       <w:pPr>
         <w:spacing w:before="240"/>
         <w:jc w:val="center"/>
@@ -4530,7 +4535,7 @@
           <w:b/>
           <w:i w:val="0"/>
         </w:rPr>
-        <w:t>ANEXO I – DECLARAÇÃO DE FÉ</w:t>
+        <w:t>ANEXO I – DECLARAÇÃO DE FÉ DA [NOME COMPLETO DA IGREJA]</w:t>
       </w:r>
     </w:p>
     <w:p>
@@ -4542,7 +4547,512 @@
           <w:b w:val="0"/>
           <w:i/>
         </w:rPr>
-        <w:t>(A ser redigida e aprovada pela Assembleia Geral, contendo os fundamentos doutrinários da IGREJA: Escrituras Sagradas, Deus, salvação, sacramentos ou ordenanças, igreja, ética e vida cristã, e demais pontos que a comunidade entenda essenciais.)</w:t>
+        <w:t>Parte integrante do Estatuto Social (art. 6º), alterável somente na forma do art. 20, § 1º, I.</w:t>
+      </w:r>
+    </w:p>
+    <w:p>
+      <w:pPr>
+        <w:jc w:val="center"/>
+      </w:pPr>
+      <w:r>
+        <w:rPr>
+          <w:b/>
+          <w:i/>
+        </w:rPr>
+        <w:t>PREÂMBULO</w:t>
+      </w:r>
+    </w:p>
+    <w:p>
+      <w:pPr>
+        <w:ind w:firstLine="709"/>
+        <w:jc w:val="both"/>
+      </w:pPr>
+      <w:r>
+        <w:rPr>
+          <w:b w:val="0"/>
+          <w:i w:val="0"/>
+        </w:rPr>
+        <w:t>A [NOME COMPLETO DA IGREJA], no exercício da liberdade de crença e de culto assegurada pelo art. 5º, VI, da Constituição Federal e da autonomia de organização reconhecida às organizações religiosas pelo art. 44, § 1º, do Código Civil, declara publicamente, por meio deste documento, os fundamentos de sua fé, que orientam seu culto, seu ensino, sua disciplina, sua missão e a vida de seus membros e ministros. Esta Declaração expressa convicções religiosas sinceramente professadas e não se destina a ofender, excluir ou discriminar qualquer pessoa, a quem a IGREJA estende respeito, acolhimento e o anúncio do Evangelho.</w:t>
+      </w:r>
+    </w:p>
+    <w:p>
+      <w:pPr>
+        <w:jc w:val="center"/>
+      </w:pPr>
+      <w:r>
+        <w:rPr>
+          <w:b/>
+          <w:i/>
+        </w:rPr>
+        <w:t>I – DAS ESCRITURAS SAGRADAS</w:t>
+      </w:r>
+    </w:p>
+    <w:p>
+      <w:pPr>
+        <w:ind w:firstLine="709"/>
+        <w:jc w:val="both"/>
+      </w:pPr>
+      <w:r>
+        <w:rPr>
+          <w:b w:val="0"/>
+          <w:i w:val="0"/>
+        </w:rPr>
+        <w:t>Cremos que a Bíblia Sagrada, composta pelos 39 livros do Antigo Testamento e pelos 27 livros do Novo Testamento, é a Palavra de Deus, divinamente inspirada, infalível e suficiente, constituindo a única regra de fé e prática da IGREJA e o critério supremo pelo qual devem ser julgadas todas as doutrinas, tradições e condutas (2 Timóteo 3.16-17; 2 Pedro 1.20-21; Salmo 119.105).</w:t>
+      </w:r>
+    </w:p>
+    <w:p>
+      <w:pPr>
+        <w:jc w:val="center"/>
+      </w:pPr>
+      <w:r>
+        <w:rPr>
+          <w:b/>
+          <w:i/>
+        </w:rPr>
+        <w:t>II – DE DEUS</w:t>
+      </w:r>
+    </w:p>
+    <w:p>
+      <w:pPr>
+        <w:ind w:firstLine="709"/>
+        <w:jc w:val="both"/>
+      </w:pPr>
+      <w:r>
+        <w:rPr>
+          <w:b w:val="0"/>
+          <w:i w:val="0"/>
+        </w:rPr>
+        <w:t>Cremos em um só Deus, eterno, onipotente, onisciente, onipresente, santo, justo e amoroso, Criador e Sustentador de todas as coisas, que subsiste eternamente em três pessoas distintas e iguais em essência, poder e glória: o Pai, o Filho e o Espírito Santo (Deuteronômio 6.4; Mateus 28.19; 2 Coríntios 13.13).</w:t>
+      </w:r>
+    </w:p>
+    <w:p>
+      <w:pPr>
+        <w:jc w:val="center"/>
+      </w:pPr>
+      <w:r>
+        <w:rPr>
+          <w:b/>
+          <w:i/>
+        </w:rPr>
+        <w:t>III – DE JESUS CRISTO</w:t>
+      </w:r>
+    </w:p>
+    <w:p>
+      <w:pPr>
+        <w:ind w:firstLine="709"/>
+        <w:jc w:val="both"/>
+      </w:pPr>
+      <w:r>
+        <w:rPr>
+          <w:b w:val="0"/>
+          <w:i w:val="0"/>
+        </w:rPr>
+        <w:t>Cremos em Jesus Cristo, o Filho unigênito de Deus, verdadeiro Deus e verdadeiro homem, concebido pelo Espírito Santo e nascido da virgem Maria; que viveu sem pecado, morreu na cruz em lugar dos pecadores, ressuscitou corporalmente ao terceiro dia, subiu aos céus, intercede pelos seus e voltará pessoal e visivelmente para julgar os vivos e os mortos. Cremos que Ele é o único mediador entre Deus e os homens e o Senhor e Cabeça da Igreja (João 1.1-14; 1 Coríntios 15.3-4; 1 Timóteo 2.5; Atos 1.11; Efésios 1.22).</w:t>
+      </w:r>
+    </w:p>
+    <w:p>
+      <w:pPr>
+        <w:jc w:val="center"/>
+      </w:pPr>
+      <w:r>
+        <w:rPr>
+          <w:b/>
+          <w:i/>
+        </w:rPr>
+        <w:t>IV – DO ESPÍRITO SANTO</w:t>
+      </w:r>
+    </w:p>
+    <w:p>
+      <w:pPr>
+        <w:ind w:firstLine="709"/>
+        <w:jc w:val="both"/>
+      </w:pPr>
+      <w:r>
+        <w:rPr>
+          <w:b w:val="0"/>
+          <w:i w:val="0"/>
+        </w:rPr>
+        <w:t>Cremos no Espírito Santo, terceira pessoa da Trindade, que convence o mundo do pecado, da justiça e do juízo, regenera, habita, santifica, consola, guia e capacita os crentes para a vida cristã e para o serviço, concedendo-lhes dons espirituais para a edificação da Igreja (João 16.8-13; Romanos 8.9-16; 1 Coríntios 12.4-11).</w:t>
+      </w:r>
+    </w:p>
+    <w:p>
+      <w:pPr>
+        <w:ind w:firstLine="709"/>
+        <w:jc w:val="both"/>
+      </w:pPr>
+      <w:r>
+        <w:rPr>
+          <w:b w:val="0"/>
+          <w:i w:val="0"/>
+        </w:rPr>
+        <w:t>[OPÇÃO PENTECOSTAL/CARISMÁTICA:] Cremos no batismo no Espírito Santo como experiência distinta e posterior à conversão, e na atualidade de todos os dons espirituais, inclusive o falar em línguas, a profecia e os dons de cura, exercidos com ordem e submetidos às Escrituras (Atos 2.1-4; 1 Coríntios 14.26-40). [OPÇÃO TRADICIONAL: suprimir este parágrafo ou substituí-lo por redação própria.]</w:t>
+      </w:r>
+    </w:p>
+    <w:p>
+      <w:pPr>
+        <w:jc w:val="center"/>
+      </w:pPr>
+      <w:r>
+        <w:rPr>
+          <w:b/>
+          <w:i/>
+        </w:rPr>
+        <w:t>V – DO SER HUMANO E DO PECADO</w:t>
+      </w:r>
+    </w:p>
+    <w:p>
+      <w:pPr>
+        <w:ind w:firstLine="709"/>
+        <w:jc w:val="both"/>
+      </w:pPr>
+      <w:r>
+        <w:rPr>
+          <w:b w:val="0"/>
+          <w:i w:val="0"/>
+        </w:rPr>
+        <w:t>Cremos que o ser humano foi criado por Deus, à sua imagem e semelhança, homem e mulher, dotado de dignidade inviolável desde a concepção; que, pela desobediência, toda a humanidade caiu em pecado e ficou separada de Deus, sendo incapaz de salvar-se por seus próprios méritos (Gênesis 1.26-27; Romanos 3.23; Efésios 2.1-3).</w:t>
+      </w:r>
+    </w:p>
+    <w:p>
+      <w:pPr>
+        <w:jc w:val="center"/>
+      </w:pPr>
+      <w:r>
+        <w:rPr>
+          <w:b/>
+          <w:i/>
+        </w:rPr>
+        <w:t>VI – DA SALVAÇÃO</w:t>
+      </w:r>
+    </w:p>
+    <w:p>
+      <w:pPr>
+        <w:ind w:firstLine="709"/>
+        <w:jc w:val="both"/>
+      </w:pPr>
+      <w:r>
+        <w:rPr>
+          <w:b w:val="0"/>
+          <w:i w:val="0"/>
+        </w:rPr>
+        <w:t>Cremos que a salvação é dom gratuito de Deus, recebido exclusivamente pela graça, mediante a fé em Jesus Cristo, e não por obras, méritos, contribuições ou ritos; que todo aquele que se arrepende de seus pecados e crê em Cristo é justificado, regenerado e adotado como filho de Deus; e que a verdadeira fé se manifesta em boas obras e em uma vida de santificação (João 3.16; Romanos 5.1; Efésios 2.8-10; Tiago 2.17).</w:t>
+      </w:r>
+    </w:p>
+    <w:p>
+      <w:pPr>
+        <w:ind w:firstLine="709"/>
+        <w:jc w:val="both"/>
+      </w:pPr>
+      <w:r>
+        <w:rPr>
+          <w:b w:val="0"/>
+          <w:i w:val="0"/>
+        </w:rPr>
+        <w:t>Em consequência, a IGREJA declara que nenhum dízimo, oferta ou contribuição confere salvação, bênção condicionada ou posição espiritual, sendo sempre voluntários, fruto de gratidão e de fidelidade a Deus (2 Coríntios 9.7).</w:t>
+      </w:r>
+    </w:p>
+    <w:p>
+      <w:pPr>
+        <w:jc w:val="center"/>
+      </w:pPr>
+      <w:r>
+        <w:rPr>
+          <w:b/>
+          <w:i/>
+        </w:rPr>
+        <w:t>VII – DA IGREJA</w:t>
+      </w:r>
+    </w:p>
+    <w:p>
+      <w:pPr>
+        <w:ind w:firstLine="709"/>
+        <w:jc w:val="both"/>
+      </w:pPr>
+      <w:r>
+        <w:rPr>
+          <w:b w:val="0"/>
+          <w:i w:val="0"/>
+        </w:rPr>
+        <w:t>Cremos que a Igreja universal é o corpo de Cristo, formado por todos os que foram salvos por Ele, e que a igreja local é a comunidade de crentes que se reúnem regularmente para o culto, a comunhão, o ensino da Palavra, a oração, a administração das ordenanças, o serviço e a proclamação do Evangelho, governando-se na forma de seu Estatuto (Atos 2.42-47; Efésios 4.11-16; 1 Coríntios 12.12-27).</w:t>
+      </w:r>
+    </w:p>
+    <w:p>
+      <w:pPr>
+        <w:jc w:val="center"/>
+      </w:pPr>
+      <w:r>
+        <w:rPr>
+          <w:b/>
+          <w:i/>
+        </w:rPr>
+        <w:t>VIII – DAS ORDENANÇAS [OU SACRAMENTOS]</w:t>
+      </w:r>
+    </w:p>
+    <w:p>
+      <w:pPr>
+        <w:ind w:firstLine="709"/>
+        <w:jc w:val="both"/>
+      </w:pPr>
+      <w:r>
+        <w:rPr>
+          <w:b w:val="0"/>
+          <w:i w:val="0"/>
+        </w:rPr>
+        <w:t>Cremos que Cristo instituiu duas ordenanças a serem observadas pela Igreja até a sua volta:</w:t>
+      </w:r>
+    </w:p>
+    <w:p>
+      <w:pPr>
+        <w:ind w:left="850"/>
+        <w:jc w:val="both"/>
+      </w:pPr>
+      <w:r>
+        <w:rPr>
+          <w:b w:val="0"/>
+          <w:i w:val="0"/>
+        </w:rPr>
+        <w:t>I – o Batismo, símbolo público da identificação do crente com Cristo em sua morte e ressurreição, administrado em nome do Pai, do Filho e do Espírito Santo, [POR IMERSÃO, AOS QUE FIZEREM PÚBLICA PROFISSÃO DE FÉ / OU FORMA ADOTADA PELA IGREJA] (Mateus 28.19; Romanos 6.3-4);</w:t>
+      </w:r>
+    </w:p>
+    <w:p>
+      <w:pPr>
+        <w:ind w:left="850"/>
+        <w:jc w:val="both"/>
+      </w:pPr>
+      <w:r>
+        <w:rPr>
+          <w:b w:val="0"/>
+          <w:i w:val="0"/>
+        </w:rPr>
+        <w:t>II – a Ceia do Senhor, memorial da morte de Cristo e expressão da comunhão dos crentes, celebrada com pão e fruto da videira, [FRANQUEADA AOS MEMBROS E A CRISTÃOS DE OUTRAS COMUNIDADES EM COMUNHÃO COM SUAS IGREJAS / OU CRITÉRIO ADOTADO PELA IGREJA] (1 Coríntios 11.23-29).</w:t>
+      </w:r>
+    </w:p>
+    <w:p>
+      <w:pPr>
+        <w:jc w:val="center"/>
+      </w:pPr>
+      <w:r>
+        <w:rPr>
+          <w:b/>
+          <w:i/>
+        </w:rPr>
+        <w:t>IX – DO CASAMENTO E DA FAMÍLIA</w:t>
+      </w:r>
+    </w:p>
+    <w:p>
+      <w:pPr>
+        <w:ind w:firstLine="709"/>
+        <w:jc w:val="both"/>
+      </w:pPr>
+      <w:r>
+        <w:rPr>
+          <w:b w:val="0"/>
+          <w:i w:val="0"/>
+        </w:rPr>
+        <w:t>Cremos que a família é instituição criada por Deus e que o casamento, segundo as Escrituras, é a união exclusiva e permanente entre um homem e uma mulher, fundada no amor, na fidelidade e no respeito mútuo, sendo o ambiente próprio para a expressão da sexualidade (Gênesis 2.24; Mateus 19.4-6; Hebreus 13.4).</w:t>
+      </w:r>
+    </w:p>
+    <w:p>
+      <w:pPr>
+        <w:ind w:firstLine="709"/>
+        <w:jc w:val="both"/>
+      </w:pPr>
+      <w:r>
+        <w:rPr>
+          <w:b w:val="0"/>
+          <w:i w:val="0"/>
+        </w:rPr>
+        <w:t>Em respeito à sua convicção religiosa, os ministros da IGREJA somente celebrarão cerimônias religiosas de casamento e os templos da IGREJA somente serão cedidos para tais cerimônias quando conformes a esta Declaração, sem prejuízo do respeito devido a todas as pessoas e do cumprimento da legislação civil, que a IGREJA reconhece como esfera própria do Estado.</w:t>
+      </w:r>
+    </w:p>
+    <w:p>
+      <w:pPr>
+        <w:jc w:val="center"/>
+      </w:pPr>
+      <w:r>
+        <w:rPr>
+          <w:b/>
+          <w:i/>
+        </w:rPr>
+        <w:t>X – DA VIDA CRISTÃ E DA ÉTICA</w:t>
+      </w:r>
+    </w:p>
+    <w:p>
+      <w:pPr>
+        <w:ind w:firstLine="709"/>
+        <w:jc w:val="both"/>
+      </w:pPr>
+      <w:r>
+        <w:rPr>
+          <w:b w:val="0"/>
+          <w:i w:val="0"/>
+        </w:rPr>
+        <w:t>Cremos que o cristão é chamado a viver em santidade, amor, justiça, honestidade e humildade; a amar a Deus sobre todas as coisas e ao próximo como a si mesmo; a zelar pela vida e pela dignidade de toda pessoa; a proteger crianças, idosos e vulneráveis; a administrar com fidelidade os bens que possui; a trabalhar com diligência; e a cumprir as leis e respeitar as autoridades constituídas, naquilo que não contrarie a consciência formada pela Palavra de Deus (Mateus 22.37-39; Miquéias 6.8; Romanos 13.1-7; Atos 5.29).</w:t>
+      </w:r>
+    </w:p>
+    <w:p>
+      <w:pPr>
+        <w:ind w:firstLine="709"/>
+        <w:jc w:val="both"/>
+      </w:pPr>
+      <w:r>
+        <w:rPr>
+          <w:b w:val="0"/>
+          <w:i w:val="0"/>
+        </w:rPr>
+        <w:t>A IGREJA repudia toda forma de violência, abuso, discriminação, exploração e corrupção, e compromete-se com a transparência e a integridade na gestão dos recursos que lhe são confiados.</w:t>
+      </w:r>
+    </w:p>
+    <w:p>
+      <w:pPr>
+        <w:jc w:val="center"/>
+      </w:pPr>
+      <w:r>
+        <w:rPr>
+          <w:b/>
+          <w:i/>
+        </w:rPr>
+        <w:t>XI – DA MISSÃO</w:t>
+      </w:r>
+    </w:p>
+    <w:p>
+      <w:pPr>
+        <w:ind w:firstLine="709"/>
+        <w:jc w:val="both"/>
+      </w:pPr>
+      <w:r>
+        <w:rPr>
+          <w:b w:val="0"/>
+          <w:i w:val="0"/>
+        </w:rPr>
+        <w:t>Cremos que a Igreja foi comissionada por Cristo a anunciar o Evangelho a todas as pessoas, fazer discípulos, ensinar a Palavra e servir ao próximo por meio de obras de misericórdia, assistência e promoção humana, como expressão concreta do amor de Deus, sem qualquer discriminação quanto aos que recebem esse serviço (Mateus 28.18-20; Mateus 25.35-40; Gálatas 6.10).</w:t>
+      </w:r>
+    </w:p>
+    <w:p>
+      <w:pPr>
+        <w:jc w:val="center"/>
+      </w:pPr>
+      <w:r>
+        <w:rPr>
+          <w:b/>
+          <w:i/>
+        </w:rPr>
+        <w:t>XII – DAS ÚLTIMAS COISAS</w:t>
+      </w:r>
+    </w:p>
+    <w:p>
+      <w:pPr>
+        <w:ind w:firstLine="709"/>
+        <w:jc w:val="both"/>
+      </w:pPr>
+      <w:r>
+        <w:rPr>
+          <w:b w:val="0"/>
+          <w:i w:val="0"/>
+        </w:rPr>
+        <w:t>Cremos na volta pessoal de Jesus Cristo, na ressurreição dos mortos, no juízo final, na vida eterna com Deus para os salvos e na separação eterna de Deus para os que rejeitarem a sua graça, e na consumação de todas as coisas em novos céus e nova terra (1 Tessalonicenses 4.13-17; Apocalipse 20.11-15; 21.1-4).</w:t>
+      </w:r>
+    </w:p>
+    <w:p>
+      <w:pPr>
+        <w:jc w:val="center"/>
+      </w:pPr>
+      <w:r>
+        <w:rPr>
+          <w:b/>
+          <w:i/>
+        </w:rPr>
+        <w:t>XIII – DA RELIGIOSIDADE E DA LIBERDADE DE CONSCIÊNCIA</w:t>
+      </w:r>
+    </w:p>
+    <w:p>
+      <w:pPr>
+        <w:ind w:firstLine="709"/>
+        <w:jc w:val="both"/>
+      </w:pPr>
+      <w:r>
+        <w:rPr>
+          <w:b w:val="0"/>
+          <w:i w:val="0"/>
+        </w:rPr>
+        <w:t>A IGREJA defende a liberdade religiosa e de consciência de todas as pessoas, inclusive daquelas que não compartilham sua fé, e rejeita qualquer forma de coerção em matéria religiosa. A adesão a esta Declaração é livre e pessoal, sendo condição para a admissão e permanência como membro, bem como para o exercício de ministério e de cargos na IGREJA.</w:t>
+      </w:r>
+    </w:p>
+    <w:p>
+      <w:pPr>
+        <w:jc w:val="center"/>
+      </w:pPr>
+      <w:r>
+        <w:rPr>
+          <w:b/>
+          <w:i/>
+        </w:rPr>
+        <w:t>XIV – DA APLICAÇÃO DESTA DECLARAÇÃO</w:t>
+      </w:r>
+    </w:p>
+    <w:p>
+      <w:pPr>
+        <w:ind w:firstLine="709"/>
+        <w:jc w:val="both"/>
+      </w:pPr>
+      <w:r>
+        <w:rPr>
+          <w:b w:val="0"/>
+          <w:i w:val="0"/>
+        </w:rPr>
+        <w:t>Esta Declaração de Fé:</w:t>
+      </w:r>
+    </w:p>
+    <w:p>
+      <w:pPr>
+        <w:ind w:left="850"/>
+        <w:jc w:val="both"/>
+      </w:pPr>
+      <w:r>
+        <w:rPr>
+          <w:b w:val="0"/>
+          <w:i w:val="0"/>
+        </w:rPr>
+        <w:t>I – é o fundamento doutrinário do culto, do ensino, da disciplina, da ordenação de ministros e da atuação de todos os órgãos da IGREJA;</w:t>
+      </w:r>
+    </w:p>
+    <w:p>
+      <w:pPr>
+        <w:ind w:left="850"/>
+        <w:jc w:val="both"/>
+      </w:pPr>
+      <w:r>
+        <w:rPr>
+          <w:b w:val="0"/>
+          <w:i w:val="0"/>
+        </w:rPr>
+        <w:t>II – será interpretada, em matéria doutrinária, pelo Conselho Ministerial, com recurso à Assembleia Geral, nos termos do Estatuto;</w:t>
+      </w:r>
+    </w:p>
+    <w:p>
+      <w:pPr>
+        <w:ind w:left="850"/>
+        <w:jc w:val="both"/>
+      </w:pPr>
+      <w:r>
+        <w:rPr>
+          <w:b w:val="0"/>
+          <w:i w:val="0"/>
+        </w:rPr>
+        <w:t>III – não abrange nem pretende exaurir todos os aspectos da fé cristã, podendo o Conselho Ministerial editar orientações doutrinárias complementares, que não poderão contrariá-la;</w:t>
+      </w:r>
+    </w:p>
+    <w:p>
+      <w:pPr>
+        <w:ind w:left="850"/>
+        <w:jc w:val="both"/>
+      </w:pPr>
+      <w:r>
+        <w:rPr>
+          <w:b w:val="0"/>
+          <w:i w:val="0"/>
+        </w:rPr>
+        <w:t>IV – prevalece, em matéria de fé e doutrina, sobre quaisquer normas internas, e somente poderá ser alterada pela Assembleia Geral, na forma do art. 20, § 1º, I, do Estatuto.</w:t>
       </w:r>
     </w:p>
     <w:sectPr>

</xml_diff>

<commit_message>
Redige a ata da Assembleia Geral de Fundação e ajusta regra de transição do Estatuto
Inclui lista de presença dos fundadores e termo de posse com declaração de
desimpedimento; dispensa, só na fundação, os prazos de membresia dos arts. 9º e 24.

Co-Authored-By: Claude Opus 5.5 <noreply@anthropic.com>
Claude-Session: https://claude.ai/code/session_01BEp8NqqHQWjkMmYzbfUpgC
</commit_message>
<xml_diff>
--- a/estatuto-igreja/Estatuto_Social_Igreja_ISAC_v2.docx
+++ b/estatuto-igreja/Estatuto_Social_Igreja_ISAC_v2.docx
@@ -4365,7 +4365,26 @@
         <w:rPr>
           <w:b/>
         </w:rPr>
-        <w:t xml:space="preserve">Parágrafo único. </w:t>
+        <w:t xml:space="preserve">§ 1º </w:t>
+      </w:r>
+      <w:r>
+        <w:rPr>
+          <w:b w:val="0"/>
+          <w:i w:val="0"/>
+        </w:rPr>
+        <w:t>Na Assembleia Geral de Fundação, são considerados membros em plena comunhão todos os fundadores civilmente capazes que professarem a Declaração de Fé e assinarem a lista de presença, e são dispensados, exclusivamente para essa Assembleia e para a primeira eleição, os prazos de tempo de membresia previstos no art. 9º, I, e no art. 24, I, mantidos os demais requisitos do art. 24.</w:t>
+      </w:r>
+    </w:p>
+    <w:p>
+      <w:pPr>
+        <w:ind w:left="567"/>
+        <w:jc w:val="both"/>
+      </w:pPr>
+      <w:r>
+        <w:rPr>
+          <w:b/>
+        </w:rPr>
+        <w:t xml:space="preserve">§ 2º </w:t>
       </w:r>
       <w:r>
         <w:rPr>

</xml_diff>